<commit_message>
build(thesis): regenerate DOCX for Ch.2 + Ch.4 + Ch.5 + tom_tat with CIMT-ICRV-CDCM hierarchy
- thesis/chuong_2_tong_quan_tai_lieu_vi.docx — NEW, embeds Hình 2.1
  conceptual model with updated CIMT-ICRV-CDCM caption
- thesis/chuong_4_ket_qua_vi.docx — rebuilt (numerical content
  unchanged; cosmetic rebuild only)
- thesis/chuong_5_ket_luan_de_xuat_vi.docx — rebuilt with §5.1 + §5.3
  CIMT-umbrella framing
- thesis/tom_tat_noi_dung_vi.docx — NEW, dissertation summary in
  CTU tom-tat template with CIMT-ICRV-CDCM layered framework intro
- dist/SUBMISSION_FINAL/Thesis_LuanAn/ — synced Ch.2/Ch.4/Ch.5 DOCX
  copies for committee/portfolio review

Build commands (for reproducibility):
  pandoc thesis/chuong_2_tong_quan_tai_lieu_vi.md \
    -o thesis/chuong_2_tong_quan_tai_lieu_vi.docx \
    --reference-doc=templates/ctu_thesis_reference.docx
  (and equivalent for Ch.4, Ch.5; tom_tat uses ctu_tomtat_reference.docx)
</commit_message>
<xml_diff>
--- a/dist/SUBMISSION_FINAL/Thesis_LuanAn/chuong_5_ket_luan_de_xuat.docx
+++ b/dist/SUBMISSION_FINAL/Thesis_LuanAn/chuong_5_ket_luan_de_xuat.docx
@@ -33,7 +33,71 @@
         <w:pStyle w:val="FirstParagraph"/>
       </w:pPr>
       <w:r>
-        <w:t xml:space="preserve">Chương 5 tổng hợp và diễn giải kết quả từ Chương 4 dưới ánh sáng của khung lý thuyết CDCM cùng bốn lý thuyết nền là Uppsala, RBV, lý thuyết thể chế và lý thuyết thượng tầng quản trị. Chương gồm sáu phần: bàn luận kết quả theo khung lý thuyết; so sánh với nghiên cứu trước; đóng góp lý thuyết; đề xuất chính sách và quản trị; hạn chế cùng hướng nghiên cứu tương lai; và kết luận tổng thể của luận án.</w:t>
+        <w:t xml:space="preserve">Chương 5 tổng hợp và diễn giải kết quả từ Chương 4 dưới ánh sáng của</w:t>
+      </w:r>
+      <w:r>
+        <w:t xml:space="preserve"> </w:t>
+      </w:r>
+      <w:r>
+        <w:rPr>
+          <w:bCs/>
+          <w:b/>
+        </w:rPr>
+        <w:t xml:space="preserve">khung lý thuyết phân tầng CIMT–ICRV–CDCM</w:t>
+      </w:r>
+      <w:r>
+        <w:t xml:space="preserve"> </w:t>
+      </w:r>
+      <w:r>
+        <w:t xml:space="preserve">(Chương 2 §2.5.1–2.5.4) cùng bốn lý thuyết nền là Uppsala, RBV, lý thuyết thể chế và lý thuyết thượng tầng quản trị. Trong khung này,</w:t>
+      </w:r>
+      <w:r>
+        <w:t xml:space="preserve"> </w:t>
+      </w:r>
+      <w:r>
+        <w:rPr>
+          <w:bCs/>
+          <w:b/>
+        </w:rPr>
+        <w:t xml:space="preserve">CIMT (Capability–Institution Mismatch Theory)</w:t>
+      </w:r>
+      <w:r>
+        <w:t xml:space="preserve"> </w:t>
+      </w:r>
+      <w:r>
+        <w:t xml:space="preserve">là cơ chế lý thuyết bao trùm tầm trung (Merton, 1968; Whetten, 1989; Corley &amp; Gioia, 2011) tích hợp ba kênh đã khẳng định (rent protection, LoF attenuation, institutional-void amplification);</w:t>
+      </w:r>
+      <w:r>
+        <w:t xml:space="preserve"> </w:t>
+      </w:r>
+      <w:r>
+        <w:rPr>
+          <w:bCs/>
+          <w:b/>
+        </w:rPr>
+        <w:t xml:space="preserve">ICRV</w:t>
+      </w:r>
+      <w:r>
+        <w:t xml:space="preserve"> </w:t>
+      </w:r>
+      <w:r>
+        <w:t xml:space="preserve">là taxonomy phân loại 45 nền kinh tế trên hai trục (institutional capability × resource vulnerability); và</w:t>
+      </w:r>
+      <w:r>
+        <w:t xml:space="preserve"> </w:t>
+      </w:r>
+      <w:r>
+        <w:rPr>
+          <w:bCs/>
+          <w:b/>
+        </w:rPr>
+        <w:t xml:space="preserve">CDCM</w:t>
+      </w:r>
+      <w:r>
+        <w:t xml:space="preserve"> </w:t>
+      </w:r>
+      <w:r>
+        <w:t xml:space="preserve">là biểu hiện thực nghiệm cấp doanh nghiệp dưới điều kiện số hóa. Chương gồm sáu phần: bàn luận kết quả theo khung phân tầng; so sánh với nghiên cứu trước; đóng góp lý thuyết; đề xuất chính sách và quản trị; hạn chế cùng hướng nghiên cứu tương lai; và kết luận tổng thể của luận án.</w:t>
       </w:r>
     </w:p>
     <w:p>
@@ -44,22 +108,22 @@
       </w:r>
     </w:p>
     <w:bookmarkEnd w:id="21"/>
-    <w:bookmarkStart w:id="27" w:name="Xff8cef3ed320f9cf6f3fba4ff558bfed3af19c6"/>
+    <w:bookmarkStart w:id="27" w:name="Xeb3250ac8e3491cd2431bc2ba518186336d526f"/>
     <w:p>
       <w:pPr>
         <w:pStyle w:val="Heading2"/>
       </w:pPr>
       <w:r>
-        <w:t xml:space="preserve">5.1 Bàn luận kết quả theo khung lý thuyết CDCM</w:t>
-      </w:r>
-    </w:p>
-    <w:bookmarkStart w:id="22" w:name="X15bf1096964ce027ae5f38ba61f44ecafa6a90e"/>
+        <w:t xml:space="preserve">5.1 Bàn luận kết quả theo khung lý thuyết phân tầng CIMT–ICRV–CDCM</w:t>
+      </w:r>
+    </w:p>
+    <w:bookmarkStart w:id="22" w:name="X7839966215dea78300daf34b71435f48f44cd16"/>
     <w:p>
       <w:pPr>
         <w:pStyle w:val="Heading3"/>
       </w:pPr>
       <w:r>
-        <w:t xml:space="preserve">5.1.1 Dải biến thiên ICRV, xác nhận H5 và tầng thể chế của CDCM</w:t>
+        <w:t xml:space="preserve">5.1.1 Dải biến thiên ICRV, xác nhận H5 và cơ chế institutional-void amplification của CIMT</w:t>
       </w:r>
     </w:p>
     <w:p>
@@ -347,7 +411,23 @@
         <w:pStyle w:val="BodyText"/>
       </w:pPr>
       <w:r>
-        <w:t xml:space="preserve">Kết quả này xác nhận H5 và tầng thể chế của khung CDCM một cách thuyết phục: điều kiện biên cho quan hệ I-P không do một yếu tố điều tiết đơn lẻ quy định, mà do</w:t>
+        <w:t xml:space="preserve">Kết quả này xác nhận H5 và</w:t>
+      </w:r>
+      <w:r>
+        <w:t xml:space="preserve"> </w:t>
+      </w:r>
+      <w:r>
+        <w:rPr>
+          <w:bCs/>
+          <w:b/>
+        </w:rPr>
+        <w:t xml:space="preserve">cơ chế institutional-void amplification của CIMT</w:t>
+      </w:r>
+      <w:r>
+        <w:t xml:space="preserve"> </w:t>
+      </w:r>
+      <w:r>
+        <w:t xml:space="preserve">(một trong ba kênh trung tâm của CIMT, §2.5.1) một cách thuyết phục: điều kiện biên cho quan hệ I-P không do một yếu tố điều tiết đơn lẻ quy định, mà do</w:t>
       </w:r>
       <w:r>
         <w:t xml:space="preserve"> </w:t>
@@ -360,7 +440,10 @@
         <w:t xml:space="preserve">cả một chế độ thể chế</w:t>
       </w:r>
       <w:r>
-        <w:t xml:space="preserve">, được vận hành hóa thành sáu nhóm con ICRV. Hiểu theo cơ chế, ICRV vận hành như một</w:t>
+        <w:t xml:space="preserve"> </w:t>
+      </w:r>
+      <w:r>
+        <w:t xml:space="preserve">— được taxonomy ICRV (§2.5.2) phân loại thành sáu nhóm con. Hiểu theo cơ chế, ICRV vận hành như một</w:t>
       </w:r>
       <w:r>
         <w:t xml:space="preserve"> </w:t>
@@ -389,7 +472,23 @@
         <w:t xml:space="preserve">bản đồ địa hình xuất khẩu chiến lược (strategic export topography)</w:t>
       </w:r>
       <w:r>
-        <w:t xml:space="preserve">: chính chất lượng thể chế quy định nơi điểm uốn của quan hệ I-P xuất hiện, còn năng lực số đóng vai trò lá chắn bù đắp khi bộ lọc tắc nghẽn. Lý thuyết thể chế của North (1990) cùng Khanna và Palepu (2010) dự đoán rằng thể chế định hình chi phí giao dịch và cấu trúc khuyến khích; dải biến thiên ICRV chính là biểu hiện thực nghiệm của cơ chế đó, ở quy mô 45 nền kinh tế châu Á và Thái Bình Dương (phân tích đa quốc gia 45 nền kinh tế).</w:t>
+        <w:t xml:space="preserve">: chính chất lượng thể chế quy định nơi điểm uốn của quan hệ I-P xuất hiện, còn năng lực số đóng vai trò lá chắn bù đắp khi bộ lọc tắc nghẽn — chính là</w:t>
+      </w:r>
+      <w:r>
+        <w:t xml:space="preserve"> </w:t>
+      </w:r>
+      <w:r>
+        <w:rPr>
+          <w:iCs/>
+          <w:i/>
+        </w:rPr>
+        <w:t xml:space="preserve">observable signature</w:t>
+      </w:r>
+      <w:r>
+        <w:t xml:space="preserve"> </w:t>
+      </w:r>
+      <w:r>
+        <w:t xml:space="preserve">mà CDCM (§2.5.3) dự đoán. Lý thuyết thể chế của North (1990) cùng Khanna và Palepu (2010) dự đoán rằng thể chế định hình chi phí giao dịch và cấu trúc khuyến khích; dải biến thiên ICRV chính là biểu hiện thực nghiệm của cơ chế đó, ở quy mô 45 nền kinh tế châu Á và Thái Bình Dương (phân tích đa quốc gia 45 nền kinh tế).</w:t>
       </w:r>
     </w:p>
     <w:p>
@@ -1199,20 +1298,68 @@
         </m:r>
       </m:oMath>
       <w:r>
-        <w:t xml:space="preserve">, và mạnh hơn ở mẫu chỉ gồm doanh nghiệp xuất khẩu) đại diện cho một điều kiện biên mà phiên bản ban đầu của CDCM chưa dự báo hết. FIP là biểu hiện của trường hợp khi</w:t>
-      </w:r>
-      <w:r>
-        <w:t xml:space="preserve"> </w:t>
-      </w:r>
-      <w:r>
-        <w:rPr>
-          <w:bCs/>
-          <w:b/>
-        </w:rPr>
-        <w:t xml:space="preserve">cả ba tầng của CDCM</w:t>
-      </w:r>
-      <w:r>
-        <w:t xml:space="preserve">, gồm thể chế, năng lực và quản trị, đều ở mức thấp. Khi thể chế yếu, TCI thấp và DAI không phát huy tác dụng, quốc tế hóa không chỉ ngừng ở chỗ không mang lại lợi ích, mà còn gây tổn hại thực sự đến hiệu quả doanh nghiệp.</w:t>
+        <w:t xml:space="preserve">, và mạnh hơn ở mẫu chỉ gồm doanh nghiệp xuất khẩu) đại diện cho</w:t>
+      </w:r>
+      <w:r>
+        <w:t xml:space="preserve"> </w:t>
+      </w:r>
+      <w:r>
+        <w:rPr>
+          <w:bCs/>
+          <w:b/>
+        </w:rPr>
+        <w:t xml:space="preserve">trường hợp cực đoan của CIMT mismatch</w:t>
+      </w:r>
+      <w:r>
+        <w:t xml:space="preserve">: khi cả ba kênh CIMT đồng thời vận hành cực đại (rent protection thất bại, LoF cao, institutional-void cực rộng) thì</w:t>
+      </w:r>
+      <w:r>
+        <w:t xml:space="preserve"> </w:t>
+      </w:r>
+      <w:r>
+        <w:rPr>
+          <w:iCs/>
+          <w:i/>
+        </w:rPr>
+        <w:t xml:space="preserve">signature</w:t>
+      </w:r>
+      <w:r>
+        <w:t xml:space="preserve"> </w:t>
+      </w:r>
+      <w:r>
+        <w:t xml:space="preserve">không còn là chữ U ngược bị làm phẳng (như Singapore) hay bị dịch chuyển sớm (như Việt Nam), mà</w:t>
+      </w:r>
+      <w:r>
+        <w:t xml:space="preserve"> </w:t>
+      </w:r>
+      <w:r>
+        <w:rPr>
+          <w:iCs/>
+          <w:i/>
+        </w:rPr>
+        <w:t xml:space="preserve">đảo dấu</w:t>
+      </w:r>
+      <w:r>
+        <w:t xml:space="preserve"> </w:t>
+      </w:r>
+      <w:r>
+        <w:t xml:space="preserve">thành quan hệ âm đơn điệu. FIP là biểu hiện của trường hợp khi</w:t>
+      </w:r>
+      <w:r>
+        <w:t xml:space="preserve"> </w:t>
+      </w:r>
+      <w:r>
+        <w:rPr>
+          <w:bCs/>
+          <w:b/>
+        </w:rPr>
+        <w:t xml:space="preserve">cả ba lớp của khung phân tầng</w:t>
+      </w:r>
+      <w:r>
+        <w:t xml:space="preserve"> </w:t>
+      </w:r>
+      <w:r>
+        <w:t xml:space="preserve">— taxonomy ICRV ở vị trí Nhóm VI (SIDS), CIMT mismatch cực đại (capability–institution gap cực rộng), và CDCM signature trở nên triệt tiêu (DAI không phát huy tác dụng) — cùng đồng pha. Khi thể chế yếu, TCI thấp và DAI không phát huy tác dụng, quốc tế hóa không chỉ ngừng ở chỗ không mang lại lợi ích, mà còn gây tổn hại thực sự đến hiệu quả doanh nghiệp.</w:t>
       </w:r>
     </w:p>
     <w:p>
@@ -2160,13 +2307,101 @@
         <w:t xml:space="preserve">5.3 Đóng góp lý thuyết</w:t>
       </w:r>
     </w:p>
-    <w:bookmarkStart w:id="32" w:name="cdcm-làm-rõ-dai-là-nguồn-lực-tình-huống"/>
+    <w:p>
+      <w:pPr>
+        <w:pStyle w:val="FirstParagraph"/>
+      </w:pPr>
+      <w:r>
+        <w:t xml:space="preserve">Luận án đóng góp năm đề mục lý thuyết được tổ chức quanh</w:t>
+      </w:r>
+      <w:r>
+        <w:t xml:space="preserve"> </w:t>
+      </w:r>
+      <w:r>
+        <w:rPr>
+          <w:bCs/>
+          <w:b/>
+        </w:rPr>
+        <w:t xml:space="preserve">khung phân tầng CIMT–ICRV–CDCM</w:t>
+      </w:r>
+      <w:r>
+        <w:t xml:space="preserve"> </w:t>
+      </w:r>
+      <w:r>
+        <w:t xml:space="preserve">(§2.5.1–2.5.4). Đề mục đầu tiên là chính bản thân khung phân tầng:</w:t>
+      </w:r>
+      <w:r>
+        <w:t xml:space="preserve"> </w:t>
+      </w:r>
+      <w:r>
+        <w:rPr>
+          <w:bCs/>
+          <w:b/>
+        </w:rPr>
+        <w:t xml:space="preserve">CIMT (Capability–Institution Mismatch Theory)</w:t>
+      </w:r>
+      <w:r>
+        <w:t xml:space="preserve"> </w:t>
+      </w:r>
+      <w:r>
+        <w:t xml:space="preserve">được phát triển trong luận án này như một</w:t>
+      </w:r>
+      <w:r>
+        <w:t xml:space="preserve"> </w:t>
+      </w:r>
+      <w:r>
+        <w:rPr>
+          <w:iCs/>
+          <w:i/>
+        </w:rPr>
+        <w:t xml:space="preserve">middle-range integrative framework</w:t>
+      </w:r>
+      <w:r>
+        <w:t xml:space="preserve"> </w:t>
+      </w:r>
+      <w:r>
+        <w:t xml:space="preserve">(Merton, 1968; Whetten, 1989; Corley &amp; Gioia, 2011) tích hợp ba kênh đã được khẳng định (rent protection, LoF attenuation, institutional-void amplification) thành một mechanism thống nhất, neo trên taxonomy ICRV và quan sát được qua signature CDCM ở cấp doanh nghiệp. Đóng góp này không tuyên bố thay thế RBV hay institutional theory mà</w:t>
+      </w:r>
+      <w:r>
+        <w:t xml:space="preserve"> </w:t>
+      </w:r>
+      <w:r>
+        <w:rPr>
+          <w:iCs/>
+          <w:i/>
+        </w:rPr>
+        <w:t xml:space="preserve">adjudicate giữa các dự đoán cạnh tranh trên cùng một dataset đa quốc gia</w:t>
+      </w:r>
+      <w:r>
+        <w:t xml:space="preserve"> </w:t>
+      </w:r>
+      <w:r>
+        <w:t xml:space="preserve">— kiểu đóng góp Whetten (1989) và Corley &amp; Gioia (2011) công nhận là incremental but valid. Bốn đề mục còn lại — DAI là nguồn lực tình huống, FIP là điều kiện biên SIDS, ngưỡng phá vỡ tại Ấn Độ, vai trò của Bậc trên — đều là</w:t>
+      </w:r>
+      <w:r>
+        <w:t xml:space="preserve"> </w:t>
+      </w:r>
+      <w:r>
+        <w:rPr>
+          <w:iCs/>
+          <w:i/>
+        </w:rPr>
+        <w:t xml:space="preserve">signature</w:t>
+      </w:r>
+      <w:r>
+        <w:t xml:space="preserve"> </w:t>
+      </w:r>
+      <w:r>
+        <w:t xml:space="preserve">của CIMT trong các regime ICRV cụ thể.</w:t>
+      </w:r>
+    </w:p>
+    <w:bookmarkStart w:id="32" w:name="Xbed440cdff66f7371be0a6ee45ac5a26d4c88b8"/>
     <w:p>
       <w:pPr>
         <w:pStyle w:val="Heading3"/>
       </w:pPr>
       <w:r>
-        <w:t xml:space="preserve">5.3.1 CDCM: làm rõ DAI là nguồn lực tình huống</w:t>
+        <w:t xml:space="preserve">5.3.1 CDCM signature: DAI là nguồn lực tình huống dưới mismatch số hóa</w:t>
       </w:r>
     </w:p>
     <w:p>
@@ -2174,7 +2409,7 @@
         <w:pStyle w:val="FirstParagraph"/>
       </w:pPr>
       <w:r>
-        <w:t xml:space="preserve">Đóng góp lý thuyết đầu tiên là làm rõ</w:t>
+        <w:t xml:space="preserve">Đóng góp lý thuyết tiếp theo là làm rõ</w:t>
       </w:r>
       <w:r>
         <w:t xml:space="preserve"> </w:t>
@@ -2190,17 +2425,17 @@
         <w:t xml:space="preserve"> </w:t>
       </w:r>
       <w:r>
-        <w:t xml:space="preserve">trong khung CDCM. DAI có hiệu ứng nâng mặt bằng phổ quát (β = +0,172, p &lt; 0,001, mẫu gộp N=82.302 từ 45 nền kinh tế), nhưng vai trò uốn đường cong I-P lại</w:t>
-      </w:r>
-      <w:r>
-        <w:t xml:space="preserve"> </w:t>
-      </w:r>
-      <w:r>
-        <w:rPr>
-          <w:bCs/>
-          <w:b/>
-        </w:rPr>
-        <w:t xml:space="preserve">phụ thuộc bối cảnh</w:t>
+        <w:t xml:space="preserve">như observable signature của CIMT trong CDCM. DAI có hiệu ứng nâng mặt bằng phổ quát (β = +0,172, p &lt; 0,001, mẫu gộp N=82.302 từ 45 nền kinh tế), nhưng vai trò uốn đường cong I-P lại</w:t>
+      </w:r>
+      <w:r>
+        <w:t xml:space="preserve"> </w:t>
+      </w:r>
+      <w:r>
+        <w:rPr>
+          <w:bCs/>
+          <w:b/>
+        </w:rPr>
+        <w:t xml:space="preserve">phụ thuộc bối cảnh ICRV</w:t>
       </w:r>
       <w:r>
         <w:t xml:space="preserve"> </w:t>
@@ -2219,7 +2454,26 @@
         <w:t xml:space="preserve">nguồn lực tình huống</w:t>
       </w:r>
       <w:r>
-        <w:t xml:space="preserve">, một tài nguyên có vai trò thay đổi theo bối cảnh thể chế. Đáng chú ý, tương tác DAI×ICRV (p = 0,049) cho thấy hiệu ứng điều tiết của DAI</w:t>
+        <w:t xml:space="preserve"> </w:t>
+      </w:r>
+      <w:r>
+        <w:t xml:space="preserve">— chính là</w:t>
+      </w:r>
+      <w:r>
+        <w:t xml:space="preserve"> </w:t>
+      </w:r>
+      <w:r>
+        <w:rPr>
+          <w:iCs/>
+          <w:i/>
+        </w:rPr>
+        <w:t xml:space="preserve">observable signature</w:t>
+      </w:r>
+      <w:r>
+        <w:t xml:space="preserve"> </w:t>
+      </w:r>
+      <w:r>
+        <w:t xml:space="preserve">mà khung CIMT dự đoán: năng lực số đóng vai trò bù đắp cho institutional voids (kênh ba của CIMT) khi mismatch sâu sắc. Đáng chú ý, tương tác DAI×ICRV (p = 0,049) cho thấy hiệu ứng điều tiết của DAI</w:t>
       </w:r>
       <w:r>
         <w:t xml:space="preserve"> </w:t>

</xml_diff>